<commit_message>
chore: sync 2026-09-24 09:22:41 UTC
</commit_message>
<xml_diff>
--- a/deploy/prd/www/resumes/IT_Networking_resume.docx
+++ b/deploy/prd/www/resumes/IT_Networking_resume.docx
@@ -24,7 +24,7 @@
           <w:sz w:val="28"/>
           <w:szCs w:val="28"/>
         </w:rPr>
-        <w:t>David Park Omer</w:t>
+        <w:t>David Omer</w:t>
       </w:r>
     </w:p>
     <w:p>
@@ -59,7 +59,7 @@
             <w:sz w:val="20"/>
             <w:szCs w:val="20"/>
           </w:rPr>
-          <w:t>david_1428@outlook.com</w:t>
+          <w:t>david_omer@hotmail.com</w:t>
         </w:r>
       </w:hyperlink>
       <w:r>
@@ -70,7 +70,17 @@
           <w:sz w:val="20"/>
           <w:szCs w:val="20"/>
         </w:rPr>
-        <w:t xml:space="preserve"> • +1 562-833-4552</w:t>
+        <w:t xml:space="preserve"> • +1 562-</w:t>
+      </w:r>
+      <w:r>
+        <w:rPr>
+          <w:rFonts w:ascii="Aptos Display" w:hAnsi="Aptos Display"/>
+          <w:bCs/>
+          <w:w w:val="105"/>
+          <w:sz w:val="20"/>
+          <w:szCs w:val="20"/>
+        </w:rPr>
+        <w:t>377-6699</w:t>
       </w:r>
     </w:p>
     <w:p>
@@ -131,29 +141,7 @@
           <w:sz w:val="24"/>
           <w:szCs w:val="24"/>
         </w:rPr>
-        <w:t xml:space="preserve">IT and systems </w:t>
-      </w:r>
-      <w:proofErr w:type="gramStart"/>
-      <w:r>
-        <w:rPr>
-          <w:rFonts w:ascii="Aptos Display" w:hAnsi="Aptos Display" w:cs="Times New Roman"/>
-          <w:bCs/>
-          <w:w w:val="105"/>
-          <w:sz w:val="24"/>
-          <w:szCs w:val="24"/>
-        </w:rPr>
-        <w:t>professional</w:t>
-      </w:r>
-      <w:proofErr w:type="gramEnd"/>
-      <w:r>
-        <w:rPr>
-          <w:rFonts w:ascii="Aptos Display" w:hAnsi="Aptos Display" w:cs="Times New Roman"/>
-          <w:bCs/>
-          <w:w w:val="105"/>
-          <w:sz w:val="24"/>
-          <w:szCs w:val="24"/>
-        </w:rPr>
-        <w:t xml:space="preserve"> with </w:t>
+        <w:t xml:space="preserve">IT and systems professional with </w:t>
       </w:r>
       <w:r>
         <w:rPr>
@@ -611,7 +599,26 @@
           <w:sz w:val="24"/>
           <w:szCs w:val="24"/>
         </w:rPr>
-        <w:t>Designed and implemented .NET applications, APIs, integration components, automation workflows, and relational data solutions using cloud-ready architectural patterns.</w:t>
+        <w:t>Architected and developed ReviewNudge™ (</w:t>
+      </w:r>
+      <w:hyperlink r:id="rId9" w:history="1">
+        <w:r>
+          <w:rPr>
+            <w:rStyle w:val="Hyperlink"/>
+            <w:rFonts w:ascii="Aptos Display" w:eastAsia="Times New Roman" w:hAnsi="Aptos Display" w:cs="Times New Roman"/>
+            <w:sz w:val="24"/>
+            <w:szCs w:val="24"/>
+          </w:rPr>
+          <w:t>reviewnudge.solutionsetal.com</w:t>
+        </w:r>
+      </w:hyperlink>
+      <w:r>
+        <w:rPr>
+          <w:rFonts w:ascii="Aptos Display" w:eastAsia="Times New Roman" w:hAnsi="Aptos Display" w:cs="Times New Roman"/>
+          <w:sz w:val="24"/>
+          <w:szCs w:val="24"/>
+        </w:rPr>
+        <w:t>), a multi-tenant, micro-SaaS platform that automates customer review requests, follow-ups, workspace administration, and review-status tracking for service businesses.</w:t>
       </w:r>
     </w:p>
     <w:p>
@@ -634,7 +641,26 @@
           <w:sz w:val="24"/>
           <w:szCs w:val="24"/>
         </w:rPr>
-        <w:t>Built repeatable development and runtime environments using Docker, cloud platforms, and documented deployment practices.</w:t>
+        <w:t>Designed and developed Portmason™ (</w:t>
+      </w:r>
+      <w:hyperlink r:id="rId10" w:anchor="lab" w:history="1">
+        <w:r>
+          <w:rPr>
+            <w:rStyle w:val="Hyperlink"/>
+            <w:rFonts w:ascii="Aptos Display" w:eastAsia="Times New Roman" w:hAnsi="Aptos Display" w:cs="Times New Roman"/>
+            <w:sz w:val="24"/>
+            <w:szCs w:val="24"/>
+          </w:rPr>
+          <w:t>www.solutionsetal.com</w:t>
+        </w:r>
+      </w:hyperlink>
+      <w:r>
+        <w:rPr>
+          <w:rFonts w:ascii="Aptos Display" w:eastAsia="Times New Roman" w:hAnsi="Aptos Display" w:cs="Times New Roman"/>
+          <w:sz w:val="24"/>
+          <w:szCs w:val="24"/>
+        </w:rPr>
+        <w:t>), a portable automation platform that standardizes application provisioning, deployment, configuration, and operations across local and cloud environments.</w:t>
       </w:r>
     </w:p>
     <w:p>
@@ -657,7 +683,7 @@
           <w:sz w:val="24"/>
           <w:szCs w:val="24"/>
         </w:rPr>
-        <w:t xml:space="preserve">Developed reporting and data-processing workflows and applied A.I.-assisted automation to u manual overhead. </w:t>
+        <w:t>Designed and implemented .NET applications, APIs, integration components, automation workflows, and relational data solutions using cloud-ready architectural patterns.</w:t>
       </w:r>
     </w:p>
     <w:p>
@@ -680,7 +706,78 @@
           <w:sz w:val="24"/>
           <w:szCs w:val="24"/>
         </w:rPr>
-        <w:t>Designed, built, and maintain the public Et al Solutions technology platform (https://etal.solutions), demonstrating modern web architecture, API integration, automated deployment, and technical content delivery.</w:t>
+        <w:t>Built repeatable development and runtime environments using Docker, cloud platforms, and documented deployment practices.</w:t>
+      </w:r>
+    </w:p>
+    <w:p>
+      <w:pPr>
+        <w:pStyle w:val="ListParagraph"/>
+        <w:numPr>
+          <w:ilvl w:val="0"/>
+          <w:numId w:val="31"/>
+        </w:numPr>
+        <w:spacing w:before="106"/>
+        <w:rPr>
+          <w:rFonts w:ascii="Aptos Display" w:eastAsia="Times New Roman" w:hAnsi="Aptos Display" w:cs="Times New Roman"/>
+          <w:sz w:val="24"/>
+          <w:szCs w:val="24"/>
+        </w:rPr>
+      </w:pPr>
+      <w:r>
+        <w:rPr>
+          <w:rFonts w:ascii="Aptos Display" w:eastAsia="Times New Roman" w:hAnsi="Aptos Display" w:cs="Times New Roman"/>
+          <w:sz w:val="24"/>
+          <w:szCs w:val="24"/>
+        </w:rPr>
+        <w:t xml:space="preserve">Developed reporting and data-processing workflows and applied A.I.-assisted automation to u manual overhead. </w:t>
+      </w:r>
+    </w:p>
+    <w:p>
+      <w:pPr>
+        <w:pStyle w:val="ListParagraph"/>
+        <w:numPr>
+          <w:ilvl w:val="0"/>
+          <w:numId w:val="31"/>
+        </w:numPr>
+        <w:spacing w:before="106"/>
+        <w:rPr>
+          <w:rFonts w:ascii="Aptos Display" w:eastAsia="Times New Roman" w:hAnsi="Aptos Display" w:cs="Times New Roman"/>
+          <w:sz w:val="24"/>
+          <w:szCs w:val="24"/>
+        </w:rPr>
+      </w:pPr>
+      <w:r>
+        <w:rPr>
+          <w:rFonts w:ascii="Aptos Display" w:eastAsia="Times New Roman" w:hAnsi="Aptos Display" w:cs="Times New Roman"/>
+          <w:sz w:val="24"/>
+          <w:szCs w:val="24"/>
+        </w:rPr>
+        <w:t xml:space="preserve">Designed, built, and maintain the public Et al Solutions technology platform </w:t>
+      </w:r>
+      <w:r>
+        <w:rPr>
+          <w:rFonts w:ascii="Aptos Display" w:eastAsia="Times New Roman" w:hAnsi="Aptos Display" w:cs="Times New Roman"/>
+          <w:sz w:val="24"/>
+          <w:szCs w:val="24"/>
+        </w:rPr>
+        <w:lastRenderedPageBreak/>
+        <w:t>(https://solutions</w:t>
+      </w:r>
+      <w:r>
+        <w:rPr>
+          <w:rFonts w:ascii="Aptos Display" w:eastAsia="Times New Roman" w:hAnsi="Aptos Display" w:cs="Times New Roman"/>
+          <w:sz w:val="24"/>
+          <w:szCs w:val="24"/>
+        </w:rPr>
+        <w:t>etal.com</w:t>
+      </w:r>
+      <w:r>
+        <w:rPr>
+          <w:rFonts w:ascii="Aptos Display" w:eastAsia="Times New Roman" w:hAnsi="Aptos Display" w:cs="Times New Roman"/>
+          <w:sz w:val="24"/>
+          <w:szCs w:val="24"/>
+        </w:rPr>
+        <w:t>), demonstrating modern web architecture, API integration, automated deployment, and technical content delivery.</w:t>
       </w:r>
     </w:p>
     <w:p>
@@ -769,7 +866,6 @@
         <w:pStyle w:val="BulletedList"/>
       </w:pPr>
       <w:r>
-        <w:lastRenderedPageBreak/>
         <w:t>Supported enterprise data platforms and integration systems, ensuring reliable system performance and uptime</w:t>
       </w:r>
     </w:p>
@@ -1267,6 +1363,7 @@
           <w:sz w:val="26"/>
           <w:szCs w:val="26"/>
         </w:rPr>
+        <w:lastRenderedPageBreak/>
         <w:t>Tools &amp; Platforms</w:t>
       </w:r>
       <w:r>
@@ -1297,29 +1394,7 @@
           <w:sz w:val="24"/>
           <w:szCs w:val="24"/>
         </w:rPr>
-        <w:t xml:space="preserve"> </w:t>
-      </w:r>
-      <w:proofErr w:type="spellStart"/>
-      <w:r>
-        <w:rPr>
-          <w:rFonts w:ascii="Aptos Display" w:hAnsi="Aptos Display" w:cs="Times New Roman"/>
-          <w:bCs/>
-          <w:w w:val="105"/>
-          <w:sz w:val="24"/>
-          <w:szCs w:val="24"/>
-        </w:rPr>
-        <w:t>Portainer</w:t>
-      </w:r>
-      <w:proofErr w:type="spellEnd"/>
-      <w:r>
-        <w:rPr>
-          <w:rFonts w:ascii="Aptos Display" w:hAnsi="Aptos Display" w:cs="Times New Roman"/>
-          <w:bCs/>
-          <w:w w:val="105"/>
-          <w:sz w:val="24"/>
-          <w:szCs w:val="24"/>
-        </w:rPr>
-        <w:t>,</w:t>
+        <w:t xml:space="preserve"> Portainer,</w:t>
       </w:r>
       <w:r>
         <w:rPr>
@@ -1391,18 +1466,9 @@
           <w:szCs w:val="24"/>
         </w:rPr>
       </w:pPr>
-      <w:r>
-        <w:rPr>
-          <w:rFonts w:ascii="Aptos Display" w:eastAsia="Times New Roman" w:hAnsi="Aptos Display" w:cs="Times New Roman"/>
-          <w:sz w:val="24"/>
-          <w:szCs w:val="24"/>
-          <w:u w:val="single"/>
-        </w:rPr>
-        <w:tab/>
-      </w:r>
     </w:p>
     <w:sectPr>
-      <w:footerReference w:type="default" r:id="rId9"/>
+      <w:footerReference w:type="default" r:id="rId11"/>
       <w:type w:val="continuous"/>
       <w:pgSz w:w="12240" w:h="15840"/>
       <w:pgMar w:top="980" w:right="720" w:bottom="700" w:left="720" w:header="0" w:footer="507" w:gutter="0"/>
@@ -1608,14 +1674,14 @@
   <w:abstractNum w:abstractNumId="0" w15:restartNumberingAfterBreak="0">
     <w:nsid w:val="01792C49"/>
     <w:multiLevelType w:val="hybridMultilevel"/>
-    <w:tmpl w:val="37AAC918"/>
+    <w:tmpl w:val="C904543C"/>
     <w:lvl w:ilvl="0" w:tplc="04090001">
       <w:start w:val="1"/>
       <w:numFmt w:val="bullet"/>
       <w:lvlText w:val=""/>
       <w:lvlJc w:val="left"/>
       <w:pPr>
-        <w:ind w:left="1080" w:hanging="360"/>
+        <w:ind w:left="1440" w:hanging="360"/>
       </w:pPr>
       <w:rPr>
         <w:rFonts w:ascii="Symbol" w:hAnsi="Symbol" w:hint="default"/>
@@ -1627,7 +1693,7 @@
       <w:lvlText w:val="o"/>
       <w:lvlJc w:val="left"/>
       <w:pPr>
-        <w:ind w:left="1800" w:hanging="360"/>
+        <w:ind w:left="2160" w:hanging="360"/>
       </w:pPr>
       <w:rPr>
         <w:rFonts w:ascii="Courier New" w:hAnsi="Courier New" w:cs="Courier New" w:hint="default"/>
@@ -1639,7 +1705,7 @@
       <w:lvlText w:val=""/>
       <w:lvlJc w:val="left"/>
       <w:pPr>
-        <w:ind w:left="2520" w:hanging="360"/>
+        <w:ind w:left="2880" w:hanging="360"/>
       </w:pPr>
       <w:rPr>
         <w:rFonts w:ascii="Wingdings" w:hAnsi="Wingdings" w:hint="default"/>
@@ -1651,7 +1717,7 @@
       <w:lvlText w:val=""/>
       <w:lvlJc w:val="left"/>
       <w:pPr>
-        <w:ind w:left="3240" w:hanging="360"/>
+        <w:ind w:left="3600" w:hanging="360"/>
       </w:pPr>
       <w:rPr>
         <w:rFonts w:ascii="Symbol" w:hAnsi="Symbol" w:hint="default"/>
@@ -1663,7 +1729,7 @@
       <w:lvlText w:val="o"/>
       <w:lvlJc w:val="left"/>
       <w:pPr>
-        <w:ind w:left="3960" w:hanging="360"/>
+        <w:ind w:left="4320" w:hanging="360"/>
       </w:pPr>
       <w:rPr>
         <w:rFonts w:ascii="Courier New" w:hAnsi="Courier New" w:cs="Courier New" w:hint="default"/>
@@ -1675,7 +1741,7 @@
       <w:lvlText w:val=""/>
       <w:lvlJc w:val="left"/>
       <w:pPr>
-        <w:ind w:left="4680" w:hanging="360"/>
+        <w:ind w:left="5040" w:hanging="360"/>
       </w:pPr>
       <w:rPr>
         <w:rFonts w:ascii="Wingdings" w:hAnsi="Wingdings" w:hint="default"/>
@@ -1687,7 +1753,7 @@
       <w:lvlText w:val=""/>
       <w:lvlJc w:val="left"/>
       <w:pPr>
-        <w:ind w:left="5400" w:hanging="360"/>
+        <w:ind w:left="5760" w:hanging="360"/>
       </w:pPr>
       <w:rPr>
         <w:rFonts w:ascii="Symbol" w:hAnsi="Symbol" w:hint="default"/>
@@ -1699,7 +1765,7 @@
       <w:lvlText w:val="o"/>
       <w:lvlJc w:val="left"/>
       <w:pPr>
-        <w:ind w:left="6120" w:hanging="360"/>
+        <w:ind w:left="6480" w:hanging="360"/>
       </w:pPr>
       <w:rPr>
         <w:rFonts w:ascii="Courier New" w:hAnsi="Courier New" w:cs="Courier New" w:hint="default"/>
@@ -1711,7 +1777,7 @@
       <w:lvlText w:val=""/>
       <w:lvlJc w:val="left"/>
       <w:pPr>
-        <w:ind w:left="6840" w:hanging="360"/>
+        <w:ind w:left="7200" w:hanging="360"/>
       </w:pPr>
       <w:rPr>
         <w:rFonts w:ascii="Wingdings" w:hAnsi="Wingdings" w:hint="default"/>
@@ -6757,6 +6823,18 @@
       <w:sz w:val="19"/>
     </w:rPr>
   </w:style>
+  <w:style w:type="character" w:styleId="FollowedHyperlink">
+    <w:name w:val="FollowedHyperlink"/>
+    <w:basedOn w:val="DefaultParagraphFont"/>
+    <w:uiPriority w:val="99"/>
+    <w:semiHidden/>
+    <w:unhideWhenUsed/>
+    <w:rsid w:val="00103CA6"/>
+    <w:rPr>
+      <w:color w:val="800080" w:themeColor="followedHyperlink"/>
+      <w:u w:val="single"/>
+    </w:rPr>
+  </w:style>
 </w:styles>
 </file>
 

</xml_diff>